<commit_message>
Fixed typo in Coats.
</commit_message>
<xml_diff>
--- a/chapters/coats.docx
+++ b/chapters/coats.docx
@@ -1,6 +1,6 @@
 
 <file path=word/document.xml><?xml version="1.0" encoding="utf-8"?>
-<w:document xmlns:wpc="http://schemas.microsoft.com/office/word/2010/wordprocessingCanvas" xmlns:cx="http://schemas.microsoft.com/office/drawing/2014/chartex" xmlns:cx1="http://schemas.microsoft.com/office/drawing/2015/9/8/chartex" xmlns:cx2="http://schemas.microsoft.com/office/drawing/2015/10/21/chartex" xmlns:cx3="http://schemas.microsoft.com/office/drawing/2016/5/9/chartex" xmlns:cx4="http://schemas.microsoft.com/office/drawing/2016/5/10/chartex" xmlns:cx5="http://schemas.microsoft.com/office/drawing/2016/5/11/chartex" xmlns:cx6="http://schemas.microsoft.com/office/drawing/2016/5/12/chartex" xmlns:cx7="http://schemas.microsoft.com/office/drawing/2016/5/13/chartex" xmlns:cx8="http://schemas.microsoft.com/office/drawing/2016/5/14/chartex" xmlns:mc="http://schemas.openxmlformats.org/markup-compatibility/2006" xmlns:aink="http://schemas.microsoft.com/office/drawing/2016/ink" xmlns:am3d="http://schemas.microsoft.com/office/drawing/2017/model3d" xmlns:o="urn:schemas-microsoft-com:office:office" xmlns:r="http://schemas.openxmlformats.org/officeDocument/2006/relationships" xmlns:m="http://schemas.openxmlformats.org/officeDocument/2006/math" xmlns:v="urn:schemas-microsoft-com:vml" xmlns:wp14="http://schemas.microsoft.com/office/word/2010/wordprocessingDrawing" xmlns:wp="http://schemas.openxmlformats.org/drawingml/2006/wordprocessingDrawing" xmlns:w10="urn:schemas-microsoft-com:office:word" xmlns:w="http://schemas.openxmlformats.org/wordprocessingml/2006/main" xmlns:w14="http://schemas.microsoft.com/office/word/2010/wordml" xmlns:w15="http://schemas.microsoft.com/office/word/2012/wordml" xmlns:w16cex="http://schemas.microsoft.com/office/word/2018/wordml/cex" xmlns:w16cid="http://schemas.microsoft.com/office/word/2016/wordml/cid" xmlns:w16="http://schemas.microsoft.com/office/word/2018/wordml" xmlns:w16sdtdh="http://schemas.microsoft.com/office/word/2020/wordml/sdtdatahash" xmlns:w16se="http://schemas.microsoft.com/office/word/2015/wordml/symex" xmlns:wpg="http://schemas.microsoft.com/office/word/2010/wordprocessingGroup" xmlns:wpi="http://schemas.microsoft.com/office/word/2010/wordprocessingInk" xmlns:wne="http://schemas.microsoft.com/office/word/2006/wordml" xmlns:wps="http://schemas.microsoft.com/office/word/2010/wordprocessingShape" mc:Ignorable="w14 w15 w16se w16cid w16 w16cex w16sdtdh wp14">
+<w:document xmlns:wpc="http://schemas.microsoft.com/office/word/2010/wordprocessingCanvas" xmlns:cx="http://schemas.microsoft.com/office/drawing/2014/chartex" xmlns:cx1="http://schemas.microsoft.com/office/drawing/2015/9/8/chartex" xmlns:cx2="http://schemas.microsoft.com/office/drawing/2015/10/21/chartex" xmlns:cx3="http://schemas.microsoft.com/office/drawing/2016/5/9/chartex" xmlns:cx4="http://schemas.microsoft.com/office/drawing/2016/5/10/chartex" xmlns:cx5="http://schemas.microsoft.com/office/drawing/2016/5/11/chartex" xmlns:cx6="http://schemas.microsoft.com/office/drawing/2016/5/12/chartex" xmlns:cx7="http://schemas.microsoft.com/office/drawing/2016/5/13/chartex" xmlns:cx8="http://schemas.microsoft.com/office/drawing/2016/5/14/chartex" xmlns:mc="http://schemas.openxmlformats.org/markup-compatibility/2006" xmlns:aink="http://schemas.microsoft.com/office/drawing/2016/ink" xmlns:am3d="http://schemas.microsoft.com/office/drawing/2017/model3d" xmlns:o="urn:schemas-microsoft-com:office:office" xmlns:oel="http://schemas.microsoft.com/office/2019/extlst" xmlns:r="http://schemas.openxmlformats.org/officeDocument/2006/relationships" xmlns:m="http://schemas.openxmlformats.org/officeDocument/2006/math" xmlns:v="urn:schemas-microsoft-com:vml" xmlns:wp14="http://schemas.microsoft.com/office/word/2010/wordprocessingDrawing" xmlns:wp="http://schemas.openxmlformats.org/drawingml/2006/wordprocessingDrawing" xmlns:w10="urn:schemas-microsoft-com:office:word" xmlns:w="http://schemas.openxmlformats.org/wordprocessingml/2006/main" xmlns:w14="http://schemas.microsoft.com/office/word/2010/wordml" xmlns:w15="http://schemas.microsoft.com/office/word/2012/wordml" xmlns:w16cex="http://schemas.microsoft.com/office/word/2018/wordml/cex" xmlns:w16cid="http://schemas.microsoft.com/office/word/2016/wordml/cid" xmlns:w16="http://schemas.microsoft.com/office/word/2018/wordml" xmlns:w16du="http://schemas.microsoft.com/office/word/2023/wordml/word16du" xmlns:w16sdtdh="http://schemas.microsoft.com/office/word/2020/wordml/sdtdatahash" xmlns:w16sdtfl="http://schemas.microsoft.com/office/word/2024/wordml/sdtformatlock" xmlns:w16se="http://schemas.microsoft.com/office/word/2015/wordml/symex" xmlns:wpg="http://schemas.microsoft.com/office/word/2010/wordprocessingGroup" xmlns:wpi="http://schemas.microsoft.com/office/word/2010/wordprocessingInk" xmlns:wne="http://schemas.microsoft.com/office/word/2006/wordml" xmlns:wps="http://schemas.microsoft.com/office/word/2010/wordprocessingShape" mc:Ignorable="w14 w15 w16se w16cid w16 w16cex w16sdtdh w16sdtfl w16du wp14">
   <w:body>
     <w:p>
       <w:pPr>
@@ -728,7 +728,6 @@
         </w:rPr>
         <w:t xml:space="preserve"> purposes, not substantive ones. This has led to some confusion about his meaning. This is further complicated since he never defines what he means by a </w:t>
       </w:r>
-      <w:proofErr w:type="gramStart"/>
       <w:r>
         <w:rPr>
           <w:rFonts w:ascii="Times New Roman" w:hAnsi="Times New Roman" w:cs="Times New Roman"/>
@@ -745,16 +744,7 @@
           <w:sz w:val="24"/>
           <w:szCs w:val="24"/>
         </w:rPr>
-        <w:t xml:space="preserve"> purposes</w:t>
-      </w:r>
-      <w:proofErr w:type="gramEnd"/>
-      <w:r>
-        <w:rPr>
-          <w:rFonts w:ascii="Times New Roman" w:hAnsi="Times New Roman" w:cs="Times New Roman"/>
-          <w:sz w:val="24"/>
-          <w:szCs w:val="24"/>
-        </w:rPr>
-        <w:t xml:space="preserve">, leaving it to the reader to figure out from his usage what he means. And this distinction is important in understanding what Oakeshott </w:t>
+        <w:t xml:space="preserve"> purposes, leaving it to the reader to figure out from his usage what he means. And this distinction is important in understanding what Oakeshott </w:t>
       </w:r>
       <w:r>
         <w:rPr>
@@ -828,25 +818,7 @@
           <w:sz w:val="24"/>
           <w:szCs w:val="24"/>
         </w:rPr>
-        <w:t>tions” (</w:t>
-      </w:r>
-      <w:proofErr w:type="gramStart"/>
-      <w:r>
-        <w:rPr>
-          <w:rFonts w:ascii="Times New Roman" w:hAnsi="Times New Roman" w:cs="Times New Roman"/>
-          <w:sz w:val="24"/>
-          <w:szCs w:val="24"/>
-        </w:rPr>
-        <w:t>e.g.</w:t>
-      </w:r>
-      <w:proofErr w:type="gramEnd"/>
-      <w:r>
-        <w:rPr>
-          <w:rFonts w:ascii="Times New Roman" w:hAnsi="Times New Roman" w:cs="Times New Roman"/>
-          <w:sz w:val="24"/>
-          <w:szCs w:val="24"/>
-        </w:rPr>
-        <w:t xml:space="preserve"> to procreate, to have one’s needs provided for), the conception of foundational law denies its character as “non-instrumental</w:t>
+        <w:t>tions” (e.g. to procreate, to have one’s needs provided for), the conception of foundational law denies its character as “non-instrumental</w:t>
       </w:r>
       <w:r>
         <w:rPr>
@@ -880,25 +852,7 @@
           <w:sz w:val="24"/>
           <w:szCs w:val="24"/>
         </w:rPr>
-        <w:t xml:space="preserve"> conceived (</w:t>
-      </w:r>
-      <w:proofErr w:type="gramStart"/>
-      <w:r>
-        <w:rPr>
-          <w:rFonts w:ascii="Times New Roman" w:hAnsi="Times New Roman" w:cs="Times New Roman"/>
-          <w:sz w:val="24"/>
-          <w:szCs w:val="24"/>
-        </w:rPr>
-        <w:t>e.g.</w:t>
-      </w:r>
-      <w:proofErr w:type="gramEnd"/>
-      <w:r>
-        <w:rPr>
-          <w:rFonts w:ascii="Times New Roman" w:hAnsi="Times New Roman" w:cs="Times New Roman"/>
-          <w:sz w:val="24"/>
-          <w:szCs w:val="24"/>
-        </w:rPr>
-        <w:t xml:space="preserve"> moral </w:t>
+        <w:t xml:space="preserve"> conceived (e.g. moral </w:t>
       </w:r>
       <w:r>
         <w:rPr>
@@ -1018,25 +972,7 @@
           <w:sz w:val="24"/>
           <w:szCs w:val="24"/>
         </w:rPr>
-        <w:t>“</w:t>
-      </w:r>
-      <w:proofErr w:type="gramStart"/>
-      <w:r>
-        <w:rPr>
-          <w:rFonts w:ascii="Times New Roman" w:hAnsi="Times New Roman" w:cs="Times New Roman"/>
-          <w:sz w:val="24"/>
-          <w:szCs w:val="24"/>
-        </w:rPr>
-        <w:t>the</w:t>
-      </w:r>
-      <w:proofErr w:type="gramEnd"/>
-      <w:r>
-        <w:rPr>
-          <w:rFonts w:ascii="Times New Roman" w:hAnsi="Times New Roman" w:cs="Times New Roman"/>
-          <w:sz w:val="24"/>
-          <w:szCs w:val="24"/>
-        </w:rPr>
-        <w:t xml:space="preserve"> rule of law” … stands for a mode of </w:t>
+        <w:t xml:space="preserve">“the rule of law” … stands for a mode of </w:t>
       </w:r>
       <w:r>
         <w:rPr>
@@ -1674,25 +1610,7 @@
           <w:sz w:val="24"/>
           <w:szCs w:val="24"/>
         </w:rPr>
-        <w:t xml:space="preserve"> (claims to go on living, to procreate, to have one’s needs provided </w:t>
-      </w:r>
-      <w:proofErr w:type="gramStart"/>
-      <w:r>
-        <w:rPr>
-          <w:rFonts w:ascii="Times New Roman" w:hAnsi="Times New Roman" w:cs="Times New Roman"/>
-          <w:sz w:val="24"/>
-          <w:szCs w:val="24"/>
-        </w:rPr>
-        <w:t>for )</w:t>
-      </w:r>
-      <w:proofErr w:type="gramEnd"/>
-      <w:r>
-        <w:rPr>
-          <w:rFonts w:ascii="Times New Roman" w:hAnsi="Times New Roman" w:cs="Times New Roman"/>
-          <w:sz w:val="24"/>
-          <w:szCs w:val="24"/>
-        </w:rPr>
-        <w:t xml:space="preserve"> … (deny) to </w:t>
+        <w:t xml:space="preserve"> (claims to go on living, to procreate, to have one’s needs provided for ) … (deny) to </w:t>
       </w:r>
       <w:r>
         <w:rPr>
@@ -2086,43 +2004,7 @@
           <w:sz w:val="24"/>
           <w:szCs w:val="24"/>
         </w:rPr>
-        <w:t xml:space="preserve">n any particular actions, and which require acts of judgment to subscribe to), from substantive, or particular goals which can be achieved in visible particular actions such as getting in the harvest, or putting out fires, and which become inactive </w:t>
-      </w:r>
-      <w:proofErr w:type="gramStart"/>
-      <w:r>
-        <w:rPr>
-          <w:rFonts w:ascii="Times New Roman" w:hAnsi="Times New Roman" w:cs="Times New Roman"/>
-          <w:sz w:val="24"/>
-          <w:szCs w:val="24"/>
-        </w:rPr>
-        <w:t>as  purposes</w:t>
-      </w:r>
-      <w:proofErr w:type="gramEnd"/>
-      <w:r>
-        <w:rPr>
-          <w:rFonts w:ascii="Times New Roman" w:hAnsi="Times New Roman" w:cs="Times New Roman"/>
-          <w:sz w:val="24"/>
-          <w:szCs w:val="24"/>
-        </w:rPr>
-        <w:t xml:space="preserve"> once their goal is achieved. (</w:t>
-      </w:r>
-      <w:proofErr w:type="gramStart"/>
-      <w:r>
-        <w:rPr>
-          <w:rFonts w:ascii="Times New Roman" w:hAnsi="Times New Roman" w:cs="Times New Roman"/>
-          <w:sz w:val="24"/>
-          <w:szCs w:val="24"/>
-        </w:rPr>
-        <w:t>versus</w:t>
-      </w:r>
-      <w:proofErr w:type="gramEnd"/>
-      <w:r>
-        <w:rPr>
-          <w:rFonts w:ascii="Times New Roman" w:hAnsi="Times New Roman" w:cs="Times New Roman"/>
-          <w:sz w:val="24"/>
-          <w:szCs w:val="24"/>
-        </w:rPr>
-        <w:t xml:space="preserve"> </w:t>
+        <w:t xml:space="preserve">n any particular actions, and which require acts of judgment to subscribe to), from substantive, or particular goals which can be achieved in visible particular actions such as getting in the harvest, or putting out fires, and which become inactive as  purposes once their goal is achieved. (versus </w:t>
       </w:r>
       <w:r>
         <w:rPr>
@@ -4237,16 +4119,7 @@
           <w:sz w:val="24"/>
           <w:szCs w:val="24"/>
         </w:rPr>
-        <w:t xml:space="preserve"> </w:t>
-      </w:r>
-      <w:proofErr w:type="spellStart"/>
-      <w:r>
-        <w:rPr>
-          <w:rFonts w:ascii="Times New Roman" w:hAnsi="Times New Roman" w:cs="Times New Roman"/>
-          <w:sz w:val="24"/>
-          <w:szCs w:val="24"/>
-        </w:rPr>
-        <w:t>Ty</w:t>
+        <w:t xml:space="preserve"> Ty</w:t>
       </w:r>
       <w:r>
         <w:rPr>
@@ -4262,16 +4135,7 @@
           <w:sz w:val="24"/>
           <w:szCs w:val="24"/>
         </w:rPr>
-        <w:t>ler</w:t>
-      </w:r>
-      <w:proofErr w:type="spellEnd"/>
-      <w:r>
-        <w:rPr>
-          <w:rFonts w:ascii="Times New Roman" w:hAnsi="Times New Roman" w:cs="Times New Roman"/>
-          <w:sz w:val="24"/>
-          <w:szCs w:val="24"/>
-        </w:rPr>
-        <w:t xml:space="preserve">, that democracy </w:t>
+        <w:t xml:space="preserve">ler, that democracy </w:t>
       </w:r>
       <w:r>
         <w:rPr>
@@ -4506,34 +4370,7 @@
           <w:sz w:val="24"/>
           <w:szCs w:val="24"/>
         </w:rPr>
-        <w:t xml:space="preserve">, scholars </w:t>
-      </w:r>
-      <w:proofErr w:type="spellStart"/>
-      <w:r>
-        <w:rPr>
-          <w:rFonts w:ascii="Times New Roman" w:hAnsi="Times New Roman" w:cs="Times New Roman"/>
-          <w:sz w:val="24"/>
-          <w:szCs w:val="24"/>
-        </w:rPr>
-        <w:t>Orren</w:t>
-      </w:r>
-      <w:proofErr w:type="spellEnd"/>
-      <w:r>
-        <w:rPr>
-          <w:rFonts w:ascii="Times New Roman" w:hAnsi="Times New Roman" w:cs="Times New Roman"/>
-          <w:sz w:val="24"/>
-          <w:szCs w:val="24"/>
-        </w:rPr>
-        <w:t xml:space="preserve"> and </w:t>
-      </w:r>
-      <w:proofErr w:type="spellStart"/>
-      <w:r>
-        <w:rPr>
-          <w:rFonts w:ascii="Times New Roman" w:hAnsi="Times New Roman" w:cs="Times New Roman"/>
-          <w:sz w:val="24"/>
-          <w:szCs w:val="24"/>
-        </w:rPr>
-        <w:t>Skowron</w:t>
+        <w:t>, scholars Orren and Skowron</w:t>
       </w:r>
       <w:r>
         <w:rPr>
@@ -4549,16 +4386,7 @@
           <w:sz w:val="24"/>
           <w:szCs w:val="24"/>
         </w:rPr>
-        <w:t>k</w:t>
-      </w:r>
-      <w:proofErr w:type="spellEnd"/>
-      <w:r>
-        <w:rPr>
-          <w:rFonts w:ascii="Times New Roman" w:hAnsi="Times New Roman" w:cs="Times New Roman"/>
-          <w:sz w:val="24"/>
-          <w:szCs w:val="24"/>
-        </w:rPr>
-        <w:t xml:space="preserve">, analyze </w:t>
+        <w:t xml:space="preserve">k, analyze </w:t>
       </w:r>
       <w:r>
         <w:rPr>
@@ -5773,6 +5601,106 @@
         </w:rPr>
         <w:t xml:space="preserve">C. </w:t>
       </w:r>
+      <w:r>
+        <w:rPr>
+          <w:rFonts w:ascii="Times New Roman" w:hAnsi="Times New Roman" w:cs="Times New Roman"/>
+          <w:sz w:val="24"/>
+          <w:szCs w:val="24"/>
+        </w:rPr>
+        <w:t>Chu</w:t>
+      </w:r>
+      <w:r>
+        <w:rPr>
+          <w:rFonts w:ascii="Times New Roman" w:hAnsi="Times New Roman" w:cs="Times New Roman"/>
+          <w:sz w:val="24"/>
+          <w:szCs w:val="24"/>
+        </w:rPr>
+        <w:t>e</w:t>
+      </w:r>
+      <w:r>
+        <w:rPr>
+          <w:rFonts w:ascii="Times New Roman" w:hAnsi="Times New Roman" w:cs="Times New Roman"/>
+          <w:sz w:val="24"/>
+          <w:szCs w:val="24"/>
+        </w:rPr>
+        <w:t>ng</w:t>
+      </w:r>
+      <w:r>
+        <w:rPr>
+          <w:rFonts w:ascii="Times New Roman" w:hAnsi="Times New Roman" w:cs="Times New Roman"/>
+          <w:sz w:val="24"/>
+          <w:szCs w:val="24"/>
+        </w:rPr>
+        <w:t xml:space="preserve">, </w:t>
+      </w:r>
+      <w:r>
+        <w:rPr>
+          <w:rFonts w:ascii="Times New Roman" w:hAnsi="Times New Roman" w:cs="Times New Roman"/>
+          <w:i/>
+          <w:iCs/>
+          <w:sz w:val="24"/>
+          <w:szCs w:val="24"/>
+        </w:rPr>
+        <w:t>The Poetic Character of Human Activity</w:t>
+      </w:r>
+      <w:r>
+        <w:rPr>
+          <w:rFonts w:ascii="Times New Roman" w:hAnsi="Times New Roman" w:cs="Times New Roman"/>
+          <w:sz w:val="24"/>
+          <w:szCs w:val="24"/>
+        </w:rPr>
+        <w:t>, Lexington Books,</w:t>
+      </w:r>
+      <w:r>
+        <w:rPr>
+          <w:rFonts w:ascii="Times New Roman" w:hAnsi="Times New Roman" w:cs="Times New Roman"/>
+          <w:sz w:val="24"/>
+          <w:szCs w:val="24"/>
+        </w:rPr>
+        <w:t xml:space="preserve"> 2012)</w:t>
+      </w:r>
+      <w:r>
+        <w:rPr>
+          <w:rFonts w:ascii="Times New Roman" w:hAnsi="Times New Roman" w:cs="Times New Roman"/>
+          <w:sz w:val="24"/>
+          <w:szCs w:val="24"/>
+        </w:rPr>
+        <w:t>,</w:t>
+      </w:r>
+      <w:r>
+        <w:rPr>
+          <w:rFonts w:ascii="Times New Roman" w:hAnsi="Times New Roman" w:cs="Times New Roman"/>
+          <w:sz w:val="24"/>
+          <w:szCs w:val="24"/>
+        </w:rPr>
+        <w:t xml:space="preserve"> and his more generic account of the rule of law</w:t>
+      </w:r>
+      <w:r>
+        <w:rPr>
+          <w:rFonts w:ascii="Times New Roman" w:hAnsi="Times New Roman" w:cs="Times New Roman"/>
+          <w:sz w:val="24"/>
+          <w:szCs w:val="24"/>
+        </w:rPr>
+        <w:t xml:space="preserve">. See S.C. Scott, </w:t>
+      </w:r>
+      <w:r>
+        <w:rPr>
+          <w:rFonts w:ascii="Times New Roman" w:hAnsi="Times New Roman" w:cs="Times New Roman"/>
+          <w:i/>
+          <w:iCs/>
+          <w:sz w:val="24"/>
+          <w:szCs w:val="24"/>
+        </w:rPr>
+        <w:t>Seeing Like a State</w:t>
+      </w:r>
+      <w:r>
+        <w:rPr>
+          <w:rFonts w:ascii="Times New Roman" w:hAnsi="Times New Roman" w:cs="Times New Roman"/>
+          <w:sz w:val="24"/>
+          <w:szCs w:val="24"/>
+        </w:rPr>
+        <w:t xml:space="preserve">, (Yale, 2017), p. 368; and D. </w:t>
+      </w:r>
       <w:proofErr w:type="spellStart"/>
       <w:r>
         <w:rPr>
@@ -5780,23 +5708,7 @@
           <w:sz w:val="24"/>
           <w:szCs w:val="24"/>
         </w:rPr>
-        <w:t>Chu</w:t>
-      </w:r>
-      <w:r>
-        <w:rPr>
-          <w:rFonts w:ascii="Times New Roman" w:hAnsi="Times New Roman" w:cs="Times New Roman"/>
-          <w:sz w:val="24"/>
-          <w:szCs w:val="24"/>
-        </w:rPr>
-        <w:t>e</w:t>
-      </w:r>
-      <w:r>
-        <w:rPr>
-          <w:rFonts w:ascii="Times New Roman" w:hAnsi="Times New Roman" w:cs="Times New Roman"/>
-          <w:sz w:val="24"/>
-          <w:szCs w:val="24"/>
-        </w:rPr>
-        <w:t>ng</w:t>
+        <w:t>Dyzenhaus</w:t>
       </w:r>
       <w:proofErr w:type="spellEnd"/>
       <w:r>
@@ -5805,100 +5717,6 @@
           <w:sz w:val="24"/>
           <w:szCs w:val="24"/>
         </w:rPr>
-        <w:t xml:space="preserve">, </w:t>
-      </w:r>
-      <w:r>
-        <w:rPr>
-          <w:rFonts w:ascii="Times New Roman" w:hAnsi="Times New Roman" w:cs="Times New Roman"/>
-          <w:i/>
-          <w:iCs/>
-          <w:sz w:val="24"/>
-          <w:szCs w:val="24"/>
-        </w:rPr>
-        <w:t>The Poetic Character of Human Activity</w:t>
-      </w:r>
-      <w:r>
-        <w:rPr>
-          <w:rFonts w:ascii="Times New Roman" w:hAnsi="Times New Roman" w:cs="Times New Roman"/>
-          <w:sz w:val="24"/>
-          <w:szCs w:val="24"/>
-        </w:rPr>
-        <w:t>, Lexington Books,</w:t>
-      </w:r>
-      <w:r>
-        <w:rPr>
-          <w:rFonts w:ascii="Times New Roman" w:hAnsi="Times New Roman" w:cs="Times New Roman"/>
-          <w:sz w:val="24"/>
-          <w:szCs w:val="24"/>
-        </w:rPr>
-        <w:t xml:space="preserve"> 2012)</w:t>
-      </w:r>
-      <w:r>
-        <w:rPr>
-          <w:rFonts w:ascii="Times New Roman" w:hAnsi="Times New Roman" w:cs="Times New Roman"/>
-          <w:sz w:val="24"/>
-          <w:szCs w:val="24"/>
-        </w:rPr>
-        <w:t>,</w:t>
-      </w:r>
-      <w:r>
-        <w:rPr>
-          <w:rFonts w:ascii="Times New Roman" w:hAnsi="Times New Roman" w:cs="Times New Roman"/>
-          <w:sz w:val="24"/>
-          <w:szCs w:val="24"/>
-        </w:rPr>
-        <w:t xml:space="preserve"> and his more generic account of the rule of law</w:t>
-      </w:r>
-      <w:r>
-        <w:rPr>
-          <w:rFonts w:ascii="Times New Roman" w:hAnsi="Times New Roman" w:cs="Times New Roman"/>
-          <w:sz w:val="24"/>
-          <w:szCs w:val="24"/>
-        </w:rPr>
-        <w:t xml:space="preserve">. </w:t>
-      </w:r>
-      <w:r>
-        <w:rPr>
-          <w:rFonts w:ascii="Times New Roman" w:hAnsi="Times New Roman" w:cs="Times New Roman"/>
-          <w:sz w:val="24"/>
-          <w:szCs w:val="24"/>
-        </w:rPr>
-        <w:t xml:space="preserve">See S.C. Scott, </w:t>
-      </w:r>
-      <w:r>
-        <w:rPr>
-          <w:rFonts w:ascii="Times New Roman" w:hAnsi="Times New Roman" w:cs="Times New Roman"/>
-          <w:i/>
-          <w:iCs/>
-          <w:sz w:val="24"/>
-          <w:szCs w:val="24"/>
-        </w:rPr>
-        <w:t>Seeing Like a State</w:t>
-      </w:r>
-      <w:r>
-        <w:rPr>
-          <w:rFonts w:ascii="Times New Roman" w:hAnsi="Times New Roman" w:cs="Times New Roman"/>
-          <w:sz w:val="24"/>
-          <w:szCs w:val="24"/>
-        </w:rPr>
-        <w:t xml:space="preserve">, (Yale, 2017), p. 368; and D. </w:t>
-      </w:r>
-      <w:proofErr w:type="spellStart"/>
-      <w:r>
-        <w:rPr>
-          <w:rFonts w:ascii="Times New Roman" w:hAnsi="Times New Roman" w:cs="Times New Roman"/>
-          <w:sz w:val="24"/>
-          <w:szCs w:val="24"/>
-        </w:rPr>
-        <w:t>Dyzenhaus</w:t>
-      </w:r>
-      <w:proofErr w:type="spellEnd"/>
-      <w:r>
-        <w:rPr>
-          <w:rFonts w:ascii="Times New Roman" w:hAnsi="Times New Roman" w:cs="Times New Roman"/>
-          <w:sz w:val="24"/>
-          <w:szCs w:val="24"/>
-        </w:rPr>
         <w:t xml:space="preserve">, and T. Poole, eds., 2015 </w:t>
       </w:r>
       <w:r>
@@ -5917,15 +5735,7 @@
           <w:sz w:val="24"/>
           <w:szCs w:val="24"/>
         </w:rPr>
-        <w:t>, (Cambridge, 2015), p. 181</w:t>
-      </w:r>
-      <w:r>
-        <w:rPr>
-          <w:rFonts w:ascii="Times New Roman" w:hAnsi="Times New Roman" w:cs="Times New Roman"/>
-          <w:sz w:val="24"/>
-          <w:szCs w:val="24"/>
-        </w:rPr>
-        <w:t>.</w:t>
+        <w:t>, (Cambridge, 2015), p. 181.</w:t>
       </w:r>
       <w:r>
         <w:rPr>
@@ -6204,43 +6014,7 @@
           <w:sz w:val="24"/>
           <w:szCs w:val="24"/>
         </w:rPr>
-        <w:t xml:space="preserve">K. </w:t>
-      </w:r>
-      <w:proofErr w:type="spellStart"/>
-      <w:r>
-        <w:rPr>
-          <w:rFonts w:ascii="Times New Roman" w:hAnsi="Times New Roman" w:cs="Times New Roman"/>
-          <w:sz w:val="24"/>
-          <w:szCs w:val="24"/>
-        </w:rPr>
-        <w:t>Orren</w:t>
-      </w:r>
-      <w:proofErr w:type="spellEnd"/>
-      <w:r>
-        <w:rPr>
-          <w:rFonts w:ascii="Times New Roman" w:hAnsi="Times New Roman" w:cs="Times New Roman"/>
-          <w:sz w:val="24"/>
-          <w:szCs w:val="24"/>
-        </w:rPr>
-        <w:t xml:space="preserve"> and S. </w:t>
-      </w:r>
-      <w:proofErr w:type="spellStart"/>
-      <w:r>
-        <w:rPr>
-          <w:rFonts w:ascii="Times New Roman" w:hAnsi="Times New Roman" w:cs="Times New Roman"/>
-          <w:sz w:val="24"/>
-          <w:szCs w:val="24"/>
-        </w:rPr>
-        <w:t>Skowronek</w:t>
-      </w:r>
-      <w:proofErr w:type="spellEnd"/>
-      <w:r>
-        <w:rPr>
-          <w:rFonts w:ascii="Times New Roman" w:hAnsi="Times New Roman" w:cs="Times New Roman"/>
-          <w:sz w:val="24"/>
-          <w:szCs w:val="24"/>
-        </w:rPr>
-        <w:t xml:space="preserve">, </w:t>
+        <w:t xml:space="preserve">K. Orren and S. Skowronek, </w:t>
       </w:r>
       <w:r>
         <w:rPr>
@@ -6894,25 +6668,7 @@
           <w:sz w:val="24"/>
           <w:szCs w:val="24"/>
         </w:rPr>
-        <w:t xml:space="preserve"> of law and its relation to state viability, it seems obvious the importance of addressing the effects of old or advanced democracy on preservation of the political or comprehensive authority itself. If the distinctive feature of the modern state since at least </w:t>
-      </w:r>
-      <w:proofErr w:type="spellStart"/>
-      <w:r>
-        <w:rPr>
-          <w:rFonts w:ascii="Times New Roman" w:hAnsi="Times New Roman" w:cs="Times New Roman"/>
-          <w:sz w:val="24"/>
-          <w:szCs w:val="24"/>
-        </w:rPr>
-        <w:t>Bodin</w:t>
-      </w:r>
-      <w:proofErr w:type="spellEnd"/>
-      <w:r>
-        <w:rPr>
-          <w:rFonts w:ascii="Times New Roman" w:hAnsi="Times New Roman" w:cs="Times New Roman"/>
-          <w:sz w:val="24"/>
-          <w:szCs w:val="24"/>
-        </w:rPr>
-        <w:t xml:space="preserve"> is its provision of a standing frame capable of accommodati</w:t>
+        <w:t xml:space="preserve"> of law and its relation to state viability, it seems obvious the importance of addressing the effects of old or advanced democracy on preservation of the political or comprehensive authority itself. If the distinctive feature of the modern state since at least Bodin is its provision of a standing frame capable of accommodati</w:t>
       </w:r>
       <w:r>
         <w:rPr>
@@ -6955,7 +6711,23 @@
           <w:szCs w:val="24"/>
         </w:rPr>
         <w:lastRenderedPageBreak/>
-        <w:t>formal procedures, yet democracy needs these more than any other constitutional shape to protect the week from the strong. (</w:t>
+        <w:t>formal procedures, yet democracy needs these more than any other constitutional shape to protect the we</w:t>
+      </w:r>
+      <w:r>
+        <w:rPr>
+          <w:rFonts w:ascii="Times New Roman" w:hAnsi="Times New Roman" w:cs="Times New Roman"/>
+          <w:sz w:val="24"/>
+          <w:szCs w:val="24"/>
+        </w:rPr>
+        <w:t>a</w:t>
+      </w:r>
+      <w:r>
+        <w:rPr>
+          <w:rFonts w:ascii="Times New Roman" w:hAnsi="Times New Roman" w:cs="Times New Roman"/>
+          <w:sz w:val="24"/>
+          <w:szCs w:val="24"/>
+        </w:rPr>
+        <w:t>k from the strong. (</w:t>
       </w:r>
       <w:r>
         <w:rPr>
@@ -7009,7 +6781,7 @@
 </file>
 
 <file path=word/endnotes.xml><?xml version="1.0" encoding="utf-8"?>
-<w:endnotes xmlns:wpc="http://schemas.microsoft.com/office/word/2010/wordprocessingCanvas" xmlns:cx="http://schemas.microsoft.com/office/drawing/2014/chartex" xmlns:cx1="http://schemas.microsoft.com/office/drawing/2015/9/8/chartex" xmlns:cx2="http://schemas.microsoft.com/office/drawing/2015/10/21/chartex" xmlns:cx3="http://schemas.microsoft.com/office/drawing/2016/5/9/chartex" xmlns:cx4="http://schemas.microsoft.com/office/drawing/2016/5/10/chartex" xmlns:cx5="http://schemas.microsoft.com/office/drawing/2016/5/11/chartex" xmlns:cx6="http://schemas.microsoft.com/office/drawing/2016/5/12/chartex" xmlns:cx7="http://schemas.microsoft.com/office/drawing/2016/5/13/chartex" xmlns:cx8="http://schemas.microsoft.com/office/drawing/2016/5/14/chartex" xmlns:mc="http://schemas.openxmlformats.org/markup-compatibility/2006" xmlns:aink="http://schemas.microsoft.com/office/drawing/2016/ink" xmlns:am3d="http://schemas.microsoft.com/office/drawing/2017/model3d" xmlns:o="urn:schemas-microsoft-com:office:office" xmlns:r="http://schemas.openxmlformats.org/officeDocument/2006/relationships" xmlns:m="http://schemas.openxmlformats.org/officeDocument/2006/math" xmlns:v="urn:schemas-microsoft-com:vml" xmlns:wp14="http://schemas.microsoft.com/office/word/2010/wordprocessingDrawing" xmlns:wp="http://schemas.openxmlformats.org/drawingml/2006/wordprocessingDrawing" xmlns:w10="urn:schemas-microsoft-com:office:word" xmlns:w="http://schemas.openxmlformats.org/wordprocessingml/2006/main" xmlns:w14="http://schemas.microsoft.com/office/word/2010/wordml" xmlns:w15="http://schemas.microsoft.com/office/word/2012/wordml" xmlns:w16cex="http://schemas.microsoft.com/office/word/2018/wordml/cex" xmlns:w16cid="http://schemas.microsoft.com/office/word/2016/wordml/cid" xmlns:w16="http://schemas.microsoft.com/office/word/2018/wordml" xmlns:w16sdtdh="http://schemas.microsoft.com/office/word/2020/wordml/sdtdatahash" xmlns:w16se="http://schemas.microsoft.com/office/word/2015/wordml/symex" xmlns:wpg="http://schemas.microsoft.com/office/word/2010/wordprocessingGroup" xmlns:wpi="http://schemas.microsoft.com/office/word/2010/wordprocessingInk" xmlns:wne="http://schemas.microsoft.com/office/word/2006/wordml" xmlns:wps="http://schemas.microsoft.com/office/word/2010/wordprocessingShape" mc:Ignorable="w14 w15 w16se w16cid w16 w16cex w16sdtdh wp14">
+<w:endnotes xmlns:wpc="http://schemas.microsoft.com/office/word/2010/wordprocessingCanvas" xmlns:cx="http://schemas.microsoft.com/office/drawing/2014/chartex" xmlns:cx1="http://schemas.microsoft.com/office/drawing/2015/9/8/chartex" xmlns:cx2="http://schemas.microsoft.com/office/drawing/2015/10/21/chartex" xmlns:cx3="http://schemas.microsoft.com/office/drawing/2016/5/9/chartex" xmlns:cx4="http://schemas.microsoft.com/office/drawing/2016/5/10/chartex" xmlns:cx5="http://schemas.microsoft.com/office/drawing/2016/5/11/chartex" xmlns:cx6="http://schemas.microsoft.com/office/drawing/2016/5/12/chartex" xmlns:cx7="http://schemas.microsoft.com/office/drawing/2016/5/13/chartex" xmlns:cx8="http://schemas.microsoft.com/office/drawing/2016/5/14/chartex" xmlns:mc="http://schemas.openxmlformats.org/markup-compatibility/2006" xmlns:aink="http://schemas.microsoft.com/office/drawing/2016/ink" xmlns:am3d="http://schemas.microsoft.com/office/drawing/2017/model3d" xmlns:o="urn:schemas-microsoft-com:office:office" xmlns:oel="http://schemas.microsoft.com/office/2019/extlst" xmlns:r="http://schemas.openxmlformats.org/officeDocument/2006/relationships" xmlns:m="http://schemas.openxmlformats.org/officeDocument/2006/math" xmlns:v="urn:schemas-microsoft-com:vml" xmlns:wp14="http://schemas.microsoft.com/office/word/2010/wordprocessingDrawing" xmlns:wp="http://schemas.openxmlformats.org/drawingml/2006/wordprocessingDrawing" xmlns:w10="urn:schemas-microsoft-com:office:word" xmlns:w="http://schemas.openxmlformats.org/wordprocessingml/2006/main" xmlns:w14="http://schemas.microsoft.com/office/word/2010/wordml" xmlns:w15="http://schemas.microsoft.com/office/word/2012/wordml" xmlns:w16cex="http://schemas.microsoft.com/office/word/2018/wordml/cex" xmlns:w16cid="http://schemas.microsoft.com/office/word/2016/wordml/cid" xmlns:w16="http://schemas.microsoft.com/office/word/2018/wordml" xmlns:w16du="http://schemas.microsoft.com/office/word/2023/wordml/word16du" xmlns:w16sdtdh="http://schemas.microsoft.com/office/word/2020/wordml/sdtdatahash" xmlns:w16sdtfl="http://schemas.microsoft.com/office/word/2024/wordml/sdtformatlock" xmlns:w16se="http://schemas.microsoft.com/office/word/2015/wordml/symex" xmlns:wpg="http://schemas.microsoft.com/office/word/2010/wordprocessingGroup" xmlns:wpi="http://schemas.microsoft.com/office/word/2010/wordprocessingInk" xmlns:wne="http://schemas.microsoft.com/office/word/2006/wordml" xmlns:wps="http://schemas.microsoft.com/office/word/2010/wordprocessingShape" mc:Ignorable="w14 w15 w16se w16cid w16 w16cex w16sdtdh w16sdtfl w16du wp14">
   <w:endnote w:type="separator" w:id="-1">
     <w:p>
       <w:pPr>
@@ -7034,7 +6806,7 @@
 </file>
 
 <file path=word/footer1.xml><?xml version="1.0" encoding="utf-8"?>
-<w:ftr xmlns:wpc="http://schemas.microsoft.com/office/word/2010/wordprocessingCanvas" xmlns:cx="http://schemas.microsoft.com/office/drawing/2014/chartex" xmlns:cx1="http://schemas.microsoft.com/office/drawing/2015/9/8/chartex" xmlns:cx2="http://schemas.microsoft.com/office/drawing/2015/10/21/chartex" xmlns:cx3="http://schemas.microsoft.com/office/drawing/2016/5/9/chartex" xmlns:cx4="http://schemas.microsoft.com/office/drawing/2016/5/10/chartex" xmlns:cx5="http://schemas.microsoft.com/office/drawing/2016/5/11/chartex" xmlns:cx6="http://schemas.microsoft.com/office/drawing/2016/5/12/chartex" xmlns:cx7="http://schemas.microsoft.com/office/drawing/2016/5/13/chartex" xmlns:cx8="http://schemas.microsoft.com/office/drawing/2016/5/14/chartex" xmlns:mc="http://schemas.openxmlformats.org/markup-compatibility/2006" xmlns:aink="http://schemas.microsoft.com/office/drawing/2016/ink" xmlns:am3d="http://schemas.microsoft.com/office/drawing/2017/model3d" xmlns:o="urn:schemas-microsoft-com:office:office" xmlns:r="http://schemas.openxmlformats.org/officeDocument/2006/relationships" xmlns:m="http://schemas.openxmlformats.org/officeDocument/2006/math" xmlns:v="urn:schemas-microsoft-com:vml" xmlns:wp14="http://schemas.microsoft.com/office/word/2010/wordprocessingDrawing" xmlns:wp="http://schemas.openxmlformats.org/drawingml/2006/wordprocessingDrawing" xmlns:w10="urn:schemas-microsoft-com:office:word" xmlns:w="http://schemas.openxmlformats.org/wordprocessingml/2006/main" xmlns:w14="http://schemas.microsoft.com/office/word/2010/wordml" xmlns:w15="http://schemas.microsoft.com/office/word/2012/wordml" xmlns:w16cex="http://schemas.microsoft.com/office/word/2018/wordml/cex" xmlns:w16cid="http://schemas.microsoft.com/office/word/2016/wordml/cid" xmlns:w16="http://schemas.microsoft.com/office/word/2018/wordml" xmlns:w16sdtdh="http://schemas.microsoft.com/office/word/2020/wordml/sdtdatahash" xmlns:w16se="http://schemas.microsoft.com/office/word/2015/wordml/symex" xmlns:wpg="http://schemas.microsoft.com/office/word/2010/wordprocessingGroup" xmlns:wpi="http://schemas.microsoft.com/office/word/2010/wordprocessingInk" xmlns:wne="http://schemas.microsoft.com/office/word/2006/wordml" xmlns:wps="http://schemas.microsoft.com/office/word/2010/wordprocessingShape" mc:Ignorable="w14 w15 w16se w16cid w16 w16cex w16sdtdh wp14">
+<w:ftr xmlns:wpc="http://schemas.microsoft.com/office/word/2010/wordprocessingCanvas" xmlns:cx="http://schemas.microsoft.com/office/drawing/2014/chartex" xmlns:cx1="http://schemas.microsoft.com/office/drawing/2015/9/8/chartex" xmlns:cx2="http://schemas.microsoft.com/office/drawing/2015/10/21/chartex" xmlns:cx3="http://schemas.microsoft.com/office/drawing/2016/5/9/chartex" xmlns:cx4="http://schemas.microsoft.com/office/drawing/2016/5/10/chartex" xmlns:cx5="http://schemas.microsoft.com/office/drawing/2016/5/11/chartex" xmlns:cx6="http://schemas.microsoft.com/office/drawing/2016/5/12/chartex" xmlns:cx7="http://schemas.microsoft.com/office/drawing/2016/5/13/chartex" xmlns:cx8="http://schemas.microsoft.com/office/drawing/2016/5/14/chartex" xmlns:mc="http://schemas.openxmlformats.org/markup-compatibility/2006" xmlns:aink="http://schemas.microsoft.com/office/drawing/2016/ink" xmlns:am3d="http://schemas.microsoft.com/office/drawing/2017/model3d" xmlns:o="urn:schemas-microsoft-com:office:office" xmlns:oel="http://schemas.microsoft.com/office/2019/extlst" xmlns:r="http://schemas.openxmlformats.org/officeDocument/2006/relationships" xmlns:m="http://schemas.openxmlformats.org/officeDocument/2006/math" xmlns:v="urn:schemas-microsoft-com:vml" xmlns:wp14="http://schemas.microsoft.com/office/word/2010/wordprocessingDrawing" xmlns:wp="http://schemas.openxmlformats.org/drawingml/2006/wordprocessingDrawing" xmlns:w10="urn:schemas-microsoft-com:office:word" xmlns:w="http://schemas.openxmlformats.org/wordprocessingml/2006/main" xmlns:w14="http://schemas.microsoft.com/office/word/2010/wordml" xmlns:w15="http://schemas.microsoft.com/office/word/2012/wordml" xmlns:w16cex="http://schemas.microsoft.com/office/word/2018/wordml/cex" xmlns:w16cid="http://schemas.microsoft.com/office/word/2016/wordml/cid" xmlns:w16="http://schemas.microsoft.com/office/word/2018/wordml" xmlns:w16du="http://schemas.microsoft.com/office/word/2023/wordml/word16du" xmlns:w16sdtdh="http://schemas.microsoft.com/office/word/2020/wordml/sdtdatahash" xmlns:w16sdtfl="http://schemas.microsoft.com/office/word/2024/wordml/sdtformatlock" xmlns:w16se="http://schemas.microsoft.com/office/word/2015/wordml/symex" xmlns:wpg="http://schemas.microsoft.com/office/word/2010/wordprocessingGroup" xmlns:wpi="http://schemas.microsoft.com/office/word/2010/wordprocessingInk" xmlns:wne="http://schemas.microsoft.com/office/word/2006/wordml" xmlns:wps="http://schemas.microsoft.com/office/word/2010/wordprocessingShape" mc:Ignorable="w14 w15 w16se w16cid w16 w16cex w16sdtdh w16sdtfl w16du wp14">
   <w:p>
     <w:pPr>
       <w:pStyle w:val="Footer"/>
@@ -7044,7 +6816,7 @@
 </file>
 
 <file path=word/footer2.xml><?xml version="1.0" encoding="utf-8"?>
-<w:ftr xmlns:wpc="http://schemas.microsoft.com/office/word/2010/wordprocessingCanvas" xmlns:cx="http://schemas.microsoft.com/office/drawing/2014/chartex" xmlns:cx1="http://schemas.microsoft.com/office/drawing/2015/9/8/chartex" xmlns:cx2="http://schemas.microsoft.com/office/drawing/2015/10/21/chartex" xmlns:cx3="http://schemas.microsoft.com/office/drawing/2016/5/9/chartex" xmlns:cx4="http://schemas.microsoft.com/office/drawing/2016/5/10/chartex" xmlns:cx5="http://schemas.microsoft.com/office/drawing/2016/5/11/chartex" xmlns:cx6="http://schemas.microsoft.com/office/drawing/2016/5/12/chartex" xmlns:cx7="http://schemas.microsoft.com/office/drawing/2016/5/13/chartex" xmlns:cx8="http://schemas.microsoft.com/office/drawing/2016/5/14/chartex" xmlns:mc="http://schemas.openxmlformats.org/markup-compatibility/2006" xmlns:aink="http://schemas.microsoft.com/office/drawing/2016/ink" xmlns:am3d="http://schemas.microsoft.com/office/drawing/2017/model3d" xmlns:o="urn:schemas-microsoft-com:office:office" xmlns:r="http://schemas.openxmlformats.org/officeDocument/2006/relationships" xmlns:m="http://schemas.openxmlformats.org/officeDocument/2006/math" xmlns:v="urn:schemas-microsoft-com:vml" xmlns:wp14="http://schemas.microsoft.com/office/word/2010/wordprocessingDrawing" xmlns:wp="http://schemas.openxmlformats.org/drawingml/2006/wordprocessingDrawing" xmlns:w10="urn:schemas-microsoft-com:office:word" xmlns:w="http://schemas.openxmlformats.org/wordprocessingml/2006/main" xmlns:w14="http://schemas.microsoft.com/office/word/2010/wordml" xmlns:w15="http://schemas.microsoft.com/office/word/2012/wordml" xmlns:w16cex="http://schemas.microsoft.com/office/word/2018/wordml/cex" xmlns:w16cid="http://schemas.microsoft.com/office/word/2016/wordml/cid" xmlns:w16="http://schemas.microsoft.com/office/word/2018/wordml" xmlns:w16sdtdh="http://schemas.microsoft.com/office/word/2020/wordml/sdtdatahash" xmlns:w16se="http://schemas.microsoft.com/office/word/2015/wordml/symex" xmlns:wpg="http://schemas.microsoft.com/office/word/2010/wordprocessingGroup" xmlns:wpi="http://schemas.microsoft.com/office/word/2010/wordprocessingInk" xmlns:wne="http://schemas.microsoft.com/office/word/2006/wordml" xmlns:wps="http://schemas.microsoft.com/office/word/2010/wordprocessingShape" mc:Ignorable="w14 w15 w16se w16cid w16 w16cex w16sdtdh wp14">
+<w:ftr xmlns:wpc="http://schemas.microsoft.com/office/word/2010/wordprocessingCanvas" xmlns:cx="http://schemas.microsoft.com/office/drawing/2014/chartex" xmlns:cx1="http://schemas.microsoft.com/office/drawing/2015/9/8/chartex" xmlns:cx2="http://schemas.microsoft.com/office/drawing/2015/10/21/chartex" xmlns:cx3="http://schemas.microsoft.com/office/drawing/2016/5/9/chartex" xmlns:cx4="http://schemas.microsoft.com/office/drawing/2016/5/10/chartex" xmlns:cx5="http://schemas.microsoft.com/office/drawing/2016/5/11/chartex" xmlns:cx6="http://schemas.microsoft.com/office/drawing/2016/5/12/chartex" xmlns:cx7="http://schemas.microsoft.com/office/drawing/2016/5/13/chartex" xmlns:cx8="http://schemas.microsoft.com/office/drawing/2016/5/14/chartex" xmlns:mc="http://schemas.openxmlformats.org/markup-compatibility/2006" xmlns:aink="http://schemas.microsoft.com/office/drawing/2016/ink" xmlns:am3d="http://schemas.microsoft.com/office/drawing/2017/model3d" xmlns:o="urn:schemas-microsoft-com:office:office" xmlns:oel="http://schemas.microsoft.com/office/2019/extlst" xmlns:r="http://schemas.openxmlformats.org/officeDocument/2006/relationships" xmlns:m="http://schemas.openxmlformats.org/officeDocument/2006/math" xmlns:v="urn:schemas-microsoft-com:vml" xmlns:wp14="http://schemas.microsoft.com/office/word/2010/wordprocessingDrawing" xmlns:wp="http://schemas.openxmlformats.org/drawingml/2006/wordprocessingDrawing" xmlns:w10="urn:schemas-microsoft-com:office:word" xmlns:w="http://schemas.openxmlformats.org/wordprocessingml/2006/main" xmlns:w14="http://schemas.microsoft.com/office/word/2010/wordml" xmlns:w15="http://schemas.microsoft.com/office/word/2012/wordml" xmlns:w16cex="http://schemas.microsoft.com/office/word/2018/wordml/cex" xmlns:w16cid="http://schemas.microsoft.com/office/word/2016/wordml/cid" xmlns:w16="http://schemas.microsoft.com/office/word/2018/wordml" xmlns:w16du="http://schemas.microsoft.com/office/word/2023/wordml/word16du" xmlns:w16sdtdh="http://schemas.microsoft.com/office/word/2020/wordml/sdtdatahash" xmlns:w16sdtfl="http://schemas.microsoft.com/office/word/2024/wordml/sdtformatlock" xmlns:w16se="http://schemas.microsoft.com/office/word/2015/wordml/symex" xmlns:wpg="http://schemas.microsoft.com/office/word/2010/wordprocessingGroup" xmlns:wpi="http://schemas.microsoft.com/office/word/2010/wordprocessingInk" xmlns:wne="http://schemas.microsoft.com/office/word/2006/wordml" xmlns:wps="http://schemas.microsoft.com/office/word/2010/wordprocessingShape" mc:Ignorable="w14 w15 w16se w16cid w16 w16cex w16sdtdh w16sdtfl w16du wp14">
   <w:p>
     <w:pPr>
       <w:pStyle w:val="Footer"/>
@@ -7054,7 +6826,7 @@
 </file>
 
 <file path=word/footer3.xml><?xml version="1.0" encoding="utf-8"?>
-<w:ftr xmlns:wpc="http://schemas.microsoft.com/office/word/2010/wordprocessingCanvas" xmlns:cx="http://schemas.microsoft.com/office/drawing/2014/chartex" xmlns:cx1="http://schemas.microsoft.com/office/drawing/2015/9/8/chartex" xmlns:cx2="http://schemas.microsoft.com/office/drawing/2015/10/21/chartex" xmlns:cx3="http://schemas.microsoft.com/office/drawing/2016/5/9/chartex" xmlns:cx4="http://schemas.microsoft.com/office/drawing/2016/5/10/chartex" xmlns:cx5="http://schemas.microsoft.com/office/drawing/2016/5/11/chartex" xmlns:cx6="http://schemas.microsoft.com/office/drawing/2016/5/12/chartex" xmlns:cx7="http://schemas.microsoft.com/office/drawing/2016/5/13/chartex" xmlns:cx8="http://schemas.microsoft.com/office/drawing/2016/5/14/chartex" xmlns:mc="http://schemas.openxmlformats.org/markup-compatibility/2006" xmlns:aink="http://schemas.microsoft.com/office/drawing/2016/ink" xmlns:am3d="http://schemas.microsoft.com/office/drawing/2017/model3d" xmlns:o="urn:schemas-microsoft-com:office:office" xmlns:r="http://schemas.openxmlformats.org/officeDocument/2006/relationships" xmlns:m="http://schemas.openxmlformats.org/officeDocument/2006/math" xmlns:v="urn:schemas-microsoft-com:vml" xmlns:wp14="http://schemas.microsoft.com/office/word/2010/wordprocessingDrawing" xmlns:wp="http://schemas.openxmlformats.org/drawingml/2006/wordprocessingDrawing" xmlns:w10="urn:schemas-microsoft-com:office:word" xmlns:w="http://schemas.openxmlformats.org/wordprocessingml/2006/main" xmlns:w14="http://schemas.microsoft.com/office/word/2010/wordml" xmlns:w15="http://schemas.microsoft.com/office/word/2012/wordml" xmlns:w16cex="http://schemas.microsoft.com/office/word/2018/wordml/cex" xmlns:w16cid="http://schemas.microsoft.com/office/word/2016/wordml/cid" xmlns:w16="http://schemas.microsoft.com/office/word/2018/wordml" xmlns:w16sdtdh="http://schemas.microsoft.com/office/word/2020/wordml/sdtdatahash" xmlns:w16se="http://schemas.microsoft.com/office/word/2015/wordml/symex" xmlns:wpg="http://schemas.microsoft.com/office/word/2010/wordprocessingGroup" xmlns:wpi="http://schemas.microsoft.com/office/word/2010/wordprocessingInk" xmlns:wne="http://schemas.microsoft.com/office/word/2006/wordml" xmlns:wps="http://schemas.microsoft.com/office/word/2010/wordprocessingShape" mc:Ignorable="w14 w15 w16se w16cid w16 w16cex w16sdtdh wp14">
+<w:ftr xmlns:wpc="http://schemas.microsoft.com/office/word/2010/wordprocessingCanvas" xmlns:cx="http://schemas.microsoft.com/office/drawing/2014/chartex" xmlns:cx1="http://schemas.microsoft.com/office/drawing/2015/9/8/chartex" xmlns:cx2="http://schemas.microsoft.com/office/drawing/2015/10/21/chartex" xmlns:cx3="http://schemas.microsoft.com/office/drawing/2016/5/9/chartex" xmlns:cx4="http://schemas.microsoft.com/office/drawing/2016/5/10/chartex" xmlns:cx5="http://schemas.microsoft.com/office/drawing/2016/5/11/chartex" xmlns:cx6="http://schemas.microsoft.com/office/drawing/2016/5/12/chartex" xmlns:cx7="http://schemas.microsoft.com/office/drawing/2016/5/13/chartex" xmlns:cx8="http://schemas.microsoft.com/office/drawing/2016/5/14/chartex" xmlns:mc="http://schemas.openxmlformats.org/markup-compatibility/2006" xmlns:aink="http://schemas.microsoft.com/office/drawing/2016/ink" xmlns:am3d="http://schemas.microsoft.com/office/drawing/2017/model3d" xmlns:o="urn:schemas-microsoft-com:office:office" xmlns:oel="http://schemas.microsoft.com/office/2019/extlst" xmlns:r="http://schemas.openxmlformats.org/officeDocument/2006/relationships" xmlns:m="http://schemas.openxmlformats.org/officeDocument/2006/math" xmlns:v="urn:schemas-microsoft-com:vml" xmlns:wp14="http://schemas.microsoft.com/office/word/2010/wordprocessingDrawing" xmlns:wp="http://schemas.openxmlformats.org/drawingml/2006/wordprocessingDrawing" xmlns:w10="urn:schemas-microsoft-com:office:word" xmlns:w="http://schemas.openxmlformats.org/wordprocessingml/2006/main" xmlns:w14="http://schemas.microsoft.com/office/word/2010/wordml" xmlns:w15="http://schemas.microsoft.com/office/word/2012/wordml" xmlns:w16cex="http://schemas.microsoft.com/office/word/2018/wordml/cex" xmlns:w16cid="http://schemas.microsoft.com/office/word/2016/wordml/cid" xmlns:w16="http://schemas.microsoft.com/office/word/2018/wordml" xmlns:w16du="http://schemas.microsoft.com/office/word/2023/wordml/word16du" xmlns:w16sdtdh="http://schemas.microsoft.com/office/word/2020/wordml/sdtdatahash" xmlns:w16sdtfl="http://schemas.microsoft.com/office/word/2024/wordml/sdtformatlock" xmlns:w16se="http://schemas.microsoft.com/office/word/2015/wordml/symex" xmlns:wpg="http://schemas.microsoft.com/office/word/2010/wordprocessingGroup" xmlns:wpi="http://schemas.microsoft.com/office/word/2010/wordprocessingInk" xmlns:wne="http://schemas.microsoft.com/office/word/2006/wordml" xmlns:wps="http://schemas.microsoft.com/office/word/2010/wordprocessingShape" mc:Ignorable="w14 w15 w16se w16cid w16 w16cex w16sdtdh w16sdtfl w16du wp14">
   <w:p>
     <w:pPr>
       <w:pStyle w:val="Footer"/>
@@ -7064,7 +6836,7 @@
 </file>
 
 <file path=word/footnotes.xml><?xml version="1.0" encoding="utf-8"?>
-<w:footnotes xmlns:wpc="http://schemas.microsoft.com/office/word/2010/wordprocessingCanvas" xmlns:cx="http://schemas.microsoft.com/office/drawing/2014/chartex" xmlns:cx1="http://schemas.microsoft.com/office/drawing/2015/9/8/chartex" xmlns:cx2="http://schemas.microsoft.com/office/drawing/2015/10/21/chartex" xmlns:cx3="http://schemas.microsoft.com/office/drawing/2016/5/9/chartex" xmlns:cx4="http://schemas.microsoft.com/office/drawing/2016/5/10/chartex" xmlns:cx5="http://schemas.microsoft.com/office/drawing/2016/5/11/chartex" xmlns:cx6="http://schemas.microsoft.com/office/drawing/2016/5/12/chartex" xmlns:cx7="http://schemas.microsoft.com/office/drawing/2016/5/13/chartex" xmlns:cx8="http://schemas.microsoft.com/office/drawing/2016/5/14/chartex" xmlns:mc="http://schemas.openxmlformats.org/markup-compatibility/2006" xmlns:aink="http://schemas.microsoft.com/office/drawing/2016/ink" xmlns:am3d="http://schemas.microsoft.com/office/drawing/2017/model3d" xmlns:o="urn:schemas-microsoft-com:office:office" xmlns:r="http://schemas.openxmlformats.org/officeDocument/2006/relationships" xmlns:m="http://schemas.openxmlformats.org/officeDocument/2006/math" xmlns:v="urn:schemas-microsoft-com:vml" xmlns:wp14="http://schemas.microsoft.com/office/word/2010/wordprocessingDrawing" xmlns:wp="http://schemas.openxmlformats.org/drawingml/2006/wordprocessingDrawing" xmlns:w10="urn:schemas-microsoft-com:office:word" xmlns:w="http://schemas.openxmlformats.org/wordprocessingml/2006/main" xmlns:w14="http://schemas.microsoft.com/office/word/2010/wordml" xmlns:w15="http://schemas.microsoft.com/office/word/2012/wordml" xmlns:w16cex="http://schemas.microsoft.com/office/word/2018/wordml/cex" xmlns:w16cid="http://schemas.microsoft.com/office/word/2016/wordml/cid" xmlns:w16="http://schemas.microsoft.com/office/word/2018/wordml" xmlns:w16sdtdh="http://schemas.microsoft.com/office/word/2020/wordml/sdtdatahash" xmlns:w16se="http://schemas.microsoft.com/office/word/2015/wordml/symex" xmlns:wpg="http://schemas.microsoft.com/office/word/2010/wordprocessingGroup" xmlns:wpi="http://schemas.microsoft.com/office/word/2010/wordprocessingInk" xmlns:wne="http://schemas.microsoft.com/office/word/2006/wordml" xmlns:wps="http://schemas.microsoft.com/office/word/2010/wordprocessingShape" mc:Ignorable="w14 w15 w16se w16cid w16 w16cex w16sdtdh wp14">
+<w:footnotes xmlns:wpc="http://schemas.microsoft.com/office/word/2010/wordprocessingCanvas" xmlns:cx="http://schemas.microsoft.com/office/drawing/2014/chartex" xmlns:cx1="http://schemas.microsoft.com/office/drawing/2015/9/8/chartex" xmlns:cx2="http://schemas.microsoft.com/office/drawing/2015/10/21/chartex" xmlns:cx3="http://schemas.microsoft.com/office/drawing/2016/5/9/chartex" xmlns:cx4="http://schemas.microsoft.com/office/drawing/2016/5/10/chartex" xmlns:cx5="http://schemas.microsoft.com/office/drawing/2016/5/11/chartex" xmlns:cx6="http://schemas.microsoft.com/office/drawing/2016/5/12/chartex" xmlns:cx7="http://schemas.microsoft.com/office/drawing/2016/5/13/chartex" xmlns:cx8="http://schemas.microsoft.com/office/drawing/2016/5/14/chartex" xmlns:mc="http://schemas.openxmlformats.org/markup-compatibility/2006" xmlns:aink="http://schemas.microsoft.com/office/drawing/2016/ink" xmlns:am3d="http://schemas.microsoft.com/office/drawing/2017/model3d" xmlns:o="urn:schemas-microsoft-com:office:office" xmlns:oel="http://schemas.microsoft.com/office/2019/extlst" xmlns:r="http://schemas.openxmlformats.org/officeDocument/2006/relationships" xmlns:m="http://schemas.openxmlformats.org/officeDocument/2006/math" xmlns:v="urn:schemas-microsoft-com:vml" xmlns:wp14="http://schemas.microsoft.com/office/word/2010/wordprocessingDrawing" xmlns:wp="http://schemas.openxmlformats.org/drawingml/2006/wordprocessingDrawing" xmlns:w10="urn:schemas-microsoft-com:office:word" xmlns:w="http://schemas.openxmlformats.org/wordprocessingml/2006/main" xmlns:w14="http://schemas.microsoft.com/office/word/2010/wordml" xmlns:w15="http://schemas.microsoft.com/office/word/2012/wordml" xmlns:w16cex="http://schemas.microsoft.com/office/word/2018/wordml/cex" xmlns:w16cid="http://schemas.microsoft.com/office/word/2016/wordml/cid" xmlns:w16="http://schemas.microsoft.com/office/word/2018/wordml" xmlns:w16du="http://schemas.microsoft.com/office/word/2023/wordml/word16du" xmlns:w16sdtdh="http://schemas.microsoft.com/office/word/2020/wordml/sdtdatahash" xmlns:w16sdtfl="http://schemas.microsoft.com/office/word/2024/wordml/sdtformatlock" xmlns:w16se="http://schemas.microsoft.com/office/word/2015/wordml/symex" xmlns:wpg="http://schemas.microsoft.com/office/word/2010/wordprocessingGroup" xmlns:wpi="http://schemas.microsoft.com/office/word/2010/wordprocessingInk" xmlns:wne="http://schemas.microsoft.com/office/word/2006/wordml" xmlns:wps="http://schemas.microsoft.com/office/word/2010/wordprocessingShape" mc:Ignorable="w14 w15 w16se w16cid w16 w16cex w16sdtdh w16sdtfl w16du wp14">
   <w:footnote w:type="separator" w:id="-1">
     <w:p>
       <w:pPr>
@@ -7089,7 +6861,7 @@
 </file>
 
 <file path=word/header1.xml><?xml version="1.0" encoding="utf-8"?>
-<w:hdr xmlns:wpc="http://schemas.microsoft.com/office/word/2010/wordprocessingCanvas" xmlns:cx="http://schemas.microsoft.com/office/drawing/2014/chartex" xmlns:cx1="http://schemas.microsoft.com/office/drawing/2015/9/8/chartex" xmlns:cx2="http://schemas.microsoft.com/office/drawing/2015/10/21/chartex" xmlns:cx3="http://schemas.microsoft.com/office/drawing/2016/5/9/chartex" xmlns:cx4="http://schemas.microsoft.com/office/drawing/2016/5/10/chartex" xmlns:cx5="http://schemas.microsoft.com/office/drawing/2016/5/11/chartex" xmlns:cx6="http://schemas.microsoft.com/office/drawing/2016/5/12/chartex" xmlns:cx7="http://schemas.microsoft.com/office/drawing/2016/5/13/chartex" xmlns:cx8="http://schemas.microsoft.com/office/drawing/2016/5/14/chartex" xmlns:mc="http://schemas.openxmlformats.org/markup-compatibility/2006" xmlns:aink="http://schemas.microsoft.com/office/drawing/2016/ink" xmlns:am3d="http://schemas.microsoft.com/office/drawing/2017/model3d" xmlns:o="urn:schemas-microsoft-com:office:office" xmlns:r="http://schemas.openxmlformats.org/officeDocument/2006/relationships" xmlns:m="http://schemas.openxmlformats.org/officeDocument/2006/math" xmlns:v="urn:schemas-microsoft-com:vml" xmlns:wp14="http://schemas.microsoft.com/office/word/2010/wordprocessingDrawing" xmlns:wp="http://schemas.openxmlformats.org/drawingml/2006/wordprocessingDrawing" xmlns:w10="urn:schemas-microsoft-com:office:word" xmlns:w="http://schemas.openxmlformats.org/wordprocessingml/2006/main" xmlns:w14="http://schemas.microsoft.com/office/word/2010/wordml" xmlns:w15="http://schemas.microsoft.com/office/word/2012/wordml" xmlns:w16cex="http://schemas.microsoft.com/office/word/2018/wordml/cex" xmlns:w16cid="http://schemas.microsoft.com/office/word/2016/wordml/cid" xmlns:w16="http://schemas.microsoft.com/office/word/2018/wordml" xmlns:w16sdtdh="http://schemas.microsoft.com/office/word/2020/wordml/sdtdatahash" xmlns:w16se="http://schemas.microsoft.com/office/word/2015/wordml/symex" xmlns:wpg="http://schemas.microsoft.com/office/word/2010/wordprocessingGroup" xmlns:wpi="http://schemas.microsoft.com/office/word/2010/wordprocessingInk" xmlns:wne="http://schemas.microsoft.com/office/word/2006/wordml" xmlns:wps="http://schemas.microsoft.com/office/word/2010/wordprocessingShape" mc:Ignorable="w14 w15 w16se w16cid w16 w16cex w16sdtdh wp14">
+<w:hdr xmlns:wpc="http://schemas.microsoft.com/office/word/2010/wordprocessingCanvas" xmlns:cx="http://schemas.microsoft.com/office/drawing/2014/chartex" xmlns:cx1="http://schemas.microsoft.com/office/drawing/2015/9/8/chartex" xmlns:cx2="http://schemas.microsoft.com/office/drawing/2015/10/21/chartex" xmlns:cx3="http://schemas.microsoft.com/office/drawing/2016/5/9/chartex" xmlns:cx4="http://schemas.microsoft.com/office/drawing/2016/5/10/chartex" xmlns:cx5="http://schemas.microsoft.com/office/drawing/2016/5/11/chartex" xmlns:cx6="http://schemas.microsoft.com/office/drawing/2016/5/12/chartex" xmlns:cx7="http://schemas.microsoft.com/office/drawing/2016/5/13/chartex" xmlns:cx8="http://schemas.microsoft.com/office/drawing/2016/5/14/chartex" xmlns:mc="http://schemas.openxmlformats.org/markup-compatibility/2006" xmlns:aink="http://schemas.microsoft.com/office/drawing/2016/ink" xmlns:am3d="http://schemas.microsoft.com/office/drawing/2017/model3d" xmlns:o="urn:schemas-microsoft-com:office:office" xmlns:oel="http://schemas.microsoft.com/office/2019/extlst" xmlns:r="http://schemas.openxmlformats.org/officeDocument/2006/relationships" xmlns:m="http://schemas.openxmlformats.org/officeDocument/2006/math" xmlns:v="urn:schemas-microsoft-com:vml" xmlns:wp14="http://schemas.microsoft.com/office/word/2010/wordprocessingDrawing" xmlns:wp="http://schemas.openxmlformats.org/drawingml/2006/wordprocessingDrawing" xmlns:w10="urn:schemas-microsoft-com:office:word" xmlns:w="http://schemas.openxmlformats.org/wordprocessingml/2006/main" xmlns:w14="http://schemas.microsoft.com/office/word/2010/wordml" xmlns:w15="http://schemas.microsoft.com/office/word/2012/wordml" xmlns:w16cex="http://schemas.microsoft.com/office/word/2018/wordml/cex" xmlns:w16cid="http://schemas.microsoft.com/office/word/2016/wordml/cid" xmlns:w16="http://schemas.microsoft.com/office/word/2018/wordml" xmlns:w16du="http://schemas.microsoft.com/office/word/2023/wordml/word16du" xmlns:w16sdtdh="http://schemas.microsoft.com/office/word/2020/wordml/sdtdatahash" xmlns:w16sdtfl="http://schemas.microsoft.com/office/word/2024/wordml/sdtformatlock" xmlns:w16se="http://schemas.microsoft.com/office/word/2015/wordml/symex" xmlns:wpg="http://schemas.microsoft.com/office/word/2010/wordprocessingGroup" xmlns:wpi="http://schemas.microsoft.com/office/word/2010/wordprocessingInk" xmlns:wne="http://schemas.microsoft.com/office/word/2006/wordml" xmlns:wps="http://schemas.microsoft.com/office/word/2010/wordprocessingShape" mc:Ignorable="w14 w15 w16se w16cid w16 w16cex w16sdtdh w16sdtfl w16du wp14">
   <w:p>
     <w:pPr>
       <w:pStyle w:val="Header"/>
@@ -7099,7 +6871,7 @@
 </file>
 
 <file path=word/header2.xml><?xml version="1.0" encoding="utf-8"?>
-<w:hdr xmlns:wpc="http://schemas.microsoft.com/office/word/2010/wordprocessingCanvas" xmlns:cx="http://schemas.microsoft.com/office/drawing/2014/chartex" xmlns:cx1="http://schemas.microsoft.com/office/drawing/2015/9/8/chartex" xmlns:cx2="http://schemas.microsoft.com/office/drawing/2015/10/21/chartex" xmlns:cx3="http://schemas.microsoft.com/office/drawing/2016/5/9/chartex" xmlns:cx4="http://schemas.microsoft.com/office/drawing/2016/5/10/chartex" xmlns:cx5="http://schemas.microsoft.com/office/drawing/2016/5/11/chartex" xmlns:cx6="http://schemas.microsoft.com/office/drawing/2016/5/12/chartex" xmlns:cx7="http://schemas.microsoft.com/office/drawing/2016/5/13/chartex" xmlns:cx8="http://schemas.microsoft.com/office/drawing/2016/5/14/chartex" xmlns:mc="http://schemas.openxmlformats.org/markup-compatibility/2006" xmlns:aink="http://schemas.microsoft.com/office/drawing/2016/ink" xmlns:am3d="http://schemas.microsoft.com/office/drawing/2017/model3d" xmlns:o="urn:schemas-microsoft-com:office:office" xmlns:r="http://schemas.openxmlformats.org/officeDocument/2006/relationships" xmlns:m="http://schemas.openxmlformats.org/officeDocument/2006/math" xmlns:v="urn:schemas-microsoft-com:vml" xmlns:wp14="http://schemas.microsoft.com/office/word/2010/wordprocessingDrawing" xmlns:wp="http://schemas.openxmlformats.org/drawingml/2006/wordprocessingDrawing" xmlns:w10="urn:schemas-microsoft-com:office:word" xmlns:w="http://schemas.openxmlformats.org/wordprocessingml/2006/main" xmlns:w14="http://schemas.microsoft.com/office/word/2010/wordml" xmlns:w15="http://schemas.microsoft.com/office/word/2012/wordml" xmlns:w16cex="http://schemas.microsoft.com/office/word/2018/wordml/cex" xmlns:w16cid="http://schemas.microsoft.com/office/word/2016/wordml/cid" xmlns:w16="http://schemas.microsoft.com/office/word/2018/wordml" xmlns:w16sdtdh="http://schemas.microsoft.com/office/word/2020/wordml/sdtdatahash" xmlns:w16se="http://schemas.microsoft.com/office/word/2015/wordml/symex" xmlns:wpg="http://schemas.microsoft.com/office/word/2010/wordprocessingGroup" xmlns:wpi="http://schemas.microsoft.com/office/word/2010/wordprocessingInk" xmlns:wne="http://schemas.microsoft.com/office/word/2006/wordml" xmlns:wps="http://schemas.microsoft.com/office/word/2010/wordprocessingShape" mc:Ignorable="w14 w15 w16se w16cid w16 w16cex w16sdtdh wp14">
+<w:hdr xmlns:wpc="http://schemas.microsoft.com/office/word/2010/wordprocessingCanvas" xmlns:cx="http://schemas.microsoft.com/office/drawing/2014/chartex" xmlns:cx1="http://schemas.microsoft.com/office/drawing/2015/9/8/chartex" xmlns:cx2="http://schemas.microsoft.com/office/drawing/2015/10/21/chartex" xmlns:cx3="http://schemas.microsoft.com/office/drawing/2016/5/9/chartex" xmlns:cx4="http://schemas.microsoft.com/office/drawing/2016/5/10/chartex" xmlns:cx5="http://schemas.microsoft.com/office/drawing/2016/5/11/chartex" xmlns:cx6="http://schemas.microsoft.com/office/drawing/2016/5/12/chartex" xmlns:cx7="http://schemas.microsoft.com/office/drawing/2016/5/13/chartex" xmlns:cx8="http://schemas.microsoft.com/office/drawing/2016/5/14/chartex" xmlns:mc="http://schemas.openxmlformats.org/markup-compatibility/2006" xmlns:aink="http://schemas.microsoft.com/office/drawing/2016/ink" xmlns:am3d="http://schemas.microsoft.com/office/drawing/2017/model3d" xmlns:o="urn:schemas-microsoft-com:office:office" xmlns:oel="http://schemas.microsoft.com/office/2019/extlst" xmlns:r="http://schemas.openxmlformats.org/officeDocument/2006/relationships" xmlns:m="http://schemas.openxmlformats.org/officeDocument/2006/math" xmlns:v="urn:schemas-microsoft-com:vml" xmlns:wp14="http://schemas.microsoft.com/office/word/2010/wordprocessingDrawing" xmlns:wp="http://schemas.openxmlformats.org/drawingml/2006/wordprocessingDrawing" xmlns:w10="urn:schemas-microsoft-com:office:word" xmlns:w="http://schemas.openxmlformats.org/wordprocessingml/2006/main" xmlns:w14="http://schemas.microsoft.com/office/word/2010/wordml" xmlns:w15="http://schemas.microsoft.com/office/word/2012/wordml" xmlns:w16cex="http://schemas.microsoft.com/office/word/2018/wordml/cex" xmlns:w16cid="http://schemas.microsoft.com/office/word/2016/wordml/cid" xmlns:w16="http://schemas.microsoft.com/office/word/2018/wordml" xmlns:w16du="http://schemas.microsoft.com/office/word/2023/wordml/word16du" xmlns:w16sdtdh="http://schemas.microsoft.com/office/word/2020/wordml/sdtdatahash" xmlns:w16sdtfl="http://schemas.microsoft.com/office/word/2024/wordml/sdtformatlock" xmlns:w16se="http://schemas.microsoft.com/office/word/2015/wordml/symex" xmlns:wpg="http://schemas.microsoft.com/office/word/2010/wordprocessingGroup" xmlns:wpi="http://schemas.microsoft.com/office/word/2010/wordprocessingInk" xmlns:wne="http://schemas.microsoft.com/office/word/2006/wordml" xmlns:wps="http://schemas.microsoft.com/office/word/2010/wordprocessingShape" mc:Ignorable="w14 w15 w16se w16cid w16 w16cex w16sdtdh w16sdtfl w16du wp14">
   <w:sdt>
     <w:sdtPr>
       <w:id w:val="-710183550"/>
@@ -7152,7 +6924,7 @@
 </file>
 
 <file path=word/header3.xml><?xml version="1.0" encoding="utf-8"?>
-<w:hdr xmlns:wpc="http://schemas.microsoft.com/office/word/2010/wordprocessingCanvas" xmlns:cx="http://schemas.microsoft.com/office/drawing/2014/chartex" xmlns:cx1="http://schemas.microsoft.com/office/drawing/2015/9/8/chartex" xmlns:cx2="http://schemas.microsoft.com/office/drawing/2015/10/21/chartex" xmlns:cx3="http://schemas.microsoft.com/office/drawing/2016/5/9/chartex" xmlns:cx4="http://schemas.microsoft.com/office/drawing/2016/5/10/chartex" xmlns:cx5="http://schemas.microsoft.com/office/drawing/2016/5/11/chartex" xmlns:cx6="http://schemas.microsoft.com/office/drawing/2016/5/12/chartex" xmlns:cx7="http://schemas.microsoft.com/office/drawing/2016/5/13/chartex" xmlns:cx8="http://schemas.microsoft.com/office/drawing/2016/5/14/chartex" xmlns:mc="http://schemas.openxmlformats.org/markup-compatibility/2006" xmlns:aink="http://schemas.microsoft.com/office/drawing/2016/ink" xmlns:am3d="http://schemas.microsoft.com/office/drawing/2017/model3d" xmlns:o="urn:schemas-microsoft-com:office:office" xmlns:r="http://schemas.openxmlformats.org/officeDocument/2006/relationships" xmlns:m="http://schemas.openxmlformats.org/officeDocument/2006/math" xmlns:v="urn:schemas-microsoft-com:vml" xmlns:wp14="http://schemas.microsoft.com/office/word/2010/wordprocessingDrawing" xmlns:wp="http://schemas.openxmlformats.org/drawingml/2006/wordprocessingDrawing" xmlns:w10="urn:schemas-microsoft-com:office:word" xmlns:w="http://schemas.openxmlformats.org/wordprocessingml/2006/main" xmlns:w14="http://schemas.microsoft.com/office/word/2010/wordml" xmlns:w15="http://schemas.microsoft.com/office/word/2012/wordml" xmlns:w16cex="http://schemas.microsoft.com/office/word/2018/wordml/cex" xmlns:w16cid="http://schemas.microsoft.com/office/word/2016/wordml/cid" xmlns:w16="http://schemas.microsoft.com/office/word/2018/wordml" xmlns:w16sdtdh="http://schemas.microsoft.com/office/word/2020/wordml/sdtdatahash" xmlns:w16se="http://schemas.microsoft.com/office/word/2015/wordml/symex" xmlns:wpg="http://schemas.microsoft.com/office/word/2010/wordprocessingGroup" xmlns:wpi="http://schemas.microsoft.com/office/word/2010/wordprocessingInk" xmlns:wne="http://schemas.microsoft.com/office/word/2006/wordml" xmlns:wps="http://schemas.microsoft.com/office/word/2010/wordprocessingShape" mc:Ignorable="w14 w15 w16se w16cid w16 w16cex w16sdtdh wp14">
+<w:hdr xmlns:wpc="http://schemas.microsoft.com/office/word/2010/wordprocessingCanvas" xmlns:cx="http://schemas.microsoft.com/office/drawing/2014/chartex" xmlns:cx1="http://schemas.microsoft.com/office/drawing/2015/9/8/chartex" xmlns:cx2="http://schemas.microsoft.com/office/drawing/2015/10/21/chartex" xmlns:cx3="http://schemas.microsoft.com/office/drawing/2016/5/9/chartex" xmlns:cx4="http://schemas.microsoft.com/office/drawing/2016/5/10/chartex" xmlns:cx5="http://schemas.microsoft.com/office/drawing/2016/5/11/chartex" xmlns:cx6="http://schemas.microsoft.com/office/drawing/2016/5/12/chartex" xmlns:cx7="http://schemas.microsoft.com/office/drawing/2016/5/13/chartex" xmlns:cx8="http://schemas.microsoft.com/office/drawing/2016/5/14/chartex" xmlns:mc="http://schemas.openxmlformats.org/markup-compatibility/2006" xmlns:aink="http://schemas.microsoft.com/office/drawing/2016/ink" xmlns:am3d="http://schemas.microsoft.com/office/drawing/2017/model3d" xmlns:o="urn:schemas-microsoft-com:office:office" xmlns:oel="http://schemas.microsoft.com/office/2019/extlst" xmlns:r="http://schemas.openxmlformats.org/officeDocument/2006/relationships" xmlns:m="http://schemas.openxmlformats.org/officeDocument/2006/math" xmlns:v="urn:schemas-microsoft-com:vml" xmlns:wp14="http://schemas.microsoft.com/office/word/2010/wordprocessingDrawing" xmlns:wp="http://schemas.openxmlformats.org/drawingml/2006/wordprocessingDrawing" xmlns:w10="urn:schemas-microsoft-com:office:word" xmlns:w="http://schemas.openxmlformats.org/wordprocessingml/2006/main" xmlns:w14="http://schemas.microsoft.com/office/word/2010/wordml" xmlns:w15="http://schemas.microsoft.com/office/word/2012/wordml" xmlns:w16cex="http://schemas.microsoft.com/office/word/2018/wordml/cex" xmlns:w16cid="http://schemas.microsoft.com/office/word/2016/wordml/cid" xmlns:w16="http://schemas.microsoft.com/office/word/2018/wordml" xmlns:w16du="http://schemas.microsoft.com/office/word/2023/wordml/word16du" xmlns:w16sdtdh="http://schemas.microsoft.com/office/word/2020/wordml/sdtdatahash" xmlns:w16sdtfl="http://schemas.microsoft.com/office/word/2024/wordml/sdtformatlock" xmlns:w16se="http://schemas.microsoft.com/office/word/2015/wordml/symex" xmlns:wpg="http://schemas.microsoft.com/office/word/2010/wordprocessingGroup" xmlns:wpi="http://schemas.microsoft.com/office/word/2010/wordprocessingInk" xmlns:wne="http://schemas.microsoft.com/office/word/2006/wordml" xmlns:wps="http://schemas.microsoft.com/office/word/2010/wordprocessingShape" mc:Ignorable="w14 w15 w16se w16cid w16 w16cex w16sdtdh w16sdtfl w16du wp14">
   <w:p>
     <w:pPr>
       <w:pStyle w:val="Header"/>
@@ -7162,7 +6934,7 @@
 </file>
 
 <file path=word/numbering.xml><?xml version="1.0" encoding="utf-8"?>
-<w:numbering xmlns:wpc="http://schemas.microsoft.com/office/word/2010/wordprocessingCanvas" xmlns:cx="http://schemas.microsoft.com/office/drawing/2014/chartex" xmlns:cx1="http://schemas.microsoft.com/office/drawing/2015/9/8/chartex" xmlns:cx2="http://schemas.microsoft.com/office/drawing/2015/10/21/chartex" xmlns:cx3="http://schemas.microsoft.com/office/drawing/2016/5/9/chartex" xmlns:cx4="http://schemas.microsoft.com/office/drawing/2016/5/10/chartex" xmlns:cx5="http://schemas.microsoft.com/office/drawing/2016/5/11/chartex" xmlns:cx6="http://schemas.microsoft.com/office/drawing/2016/5/12/chartex" xmlns:cx7="http://schemas.microsoft.com/office/drawing/2016/5/13/chartex" xmlns:cx8="http://schemas.microsoft.com/office/drawing/2016/5/14/chartex" xmlns:mc="http://schemas.openxmlformats.org/markup-compatibility/2006" xmlns:aink="http://schemas.microsoft.com/office/drawing/2016/ink" xmlns:am3d="http://schemas.microsoft.com/office/drawing/2017/model3d" xmlns:o="urn:schemas-microsoft-com:office:office" xmlns:r="http://schemas.openxmlformats.org/officeDocument/2006/relationships" xmlns:m="http://schemas.openxmlformats.org/officeDocument/2006/math" xmlns:v="urn:schemas-microsoft-com:vml" xmlns:wp14="http://schemas.microsoft.com/office/word/2010/wordprocessingDrawing" xmlns:wp="http://schemas.openxmlformats.org/drawingml/2006/wordprocessingDrawing" xmlns:w10="urn:schemas-microsoft-com:office:word" xmlns:w="http://schemas.openxmlformats.org/wordprocessingml/2006/main" xmlns:w14="http://schemas.microsoft.com/office/word/2010/wordml" xmlns:w15="http://schemas.microsoft.com/office/word/2012/wordml" xmlns:w16cex="http://schemas.microsoft.com/office/word/2018/wordml/cex" xmlns:w16cid="http://schemas.microsoft.com/office/word/2016/wordml/cid" xmlns:w16="http://schemas.microsoft.com/office/word/2018/wordml" xmlns:w16sdtdh="http://schemas.microsoft.com/office/word/2020/wordml/sdtdatahash" xmlns:w16se="http://schemas.microsoft.com/office/word/2015/wordml/symex" xmlns:wpg="http://schemas.microsoft.com/office/word/2010/wordprocessingGroup" xmlns:wpi="http://schemas.microsoft.com/office/word/2010/wordprocessingInk" xmlns:wne="http://schemas.microsoft.com/office/word/2006/wordml" xmlns:wps="http://schemas.microsoft.com/office/word/2010/wordprocessingShape" mc:Ignorable="w14 w15 w16se w16cid w16 w16cex w16sdtdh wp14">
+<w:numbering xmlns:wpc="http://schemas.microsoft.com/office/word/2010/wordprocessingCanvas" xmlns:cx="http://schemas.microsoft.com/office/drawing/2014/chartex" xmlns:cx1="http://schemas.microsoft.com/office/drawing/2015/9/8/chartex" xmlns:cx2="http://schemas.microsoft.com/office/drawing/2015/10/21/chartex" xmlns:cx3="http://schemas.microsoft.com/office/drawing/2016/5/9/chartex" xmlns:cx4="http://schemas.microsoft.com/office/drawing/2016/5/10/chartex" xmlns:cx5="http://schemas.microsoft.com/office/drawing/2016/5/11/chartex" xmlns:cx6="http://schemas.microsoft.com/office/drawing/2016/5/12/chartex" xmlns:cx7="http://schemas.microsoft.com/office/drawing/2016/5/13/chartex" xmlns:cx8="http://schemas.microsoft.com/office/drawing/2016/5/14/chartex" xmlns:mc="http://schemas.openxmlformats.org/markup-compatibility/2006" xmlns:aink="http://schemas.microsoft.com/office/drawing/2016/ink" xmlns:am3d="http://schemas.microsoft.com/office/drawing/2017/model3d" xmlns:o="urn:schemas-microsoft-com:office:office" xmlns:oel="http://schemas.microsoft.com/office/2019/extlst" xmlns:r="http://schemas.openxmlformats.org/officeDocument/2006/relationships" xmlns:m="http://schemas.openxmlformats.org/officeDocument/2006/math" xmlns:v="urn:schemas-microsoft-com:vml" xmlns:wp14="http://schemas.microsoft.com/office/word/2010/wordprocessingDrawing" xmlns:wp="http://schemas.openxmlformats.org/drawingml/2006/wordprocessingDrawing" xmlns:w10="urn:schemas-microsoft-com:office:word" xmlns:w="http://schemas.openxmlformats.org/wordprocessingml/2006/main" xmlns:w14="http://schemas.microsoft.com/office/word/2010/wordml" xmlns:w15="http://schemas.microsoft.com/office/word/2012/wordml" xmlns:w16cex="http://schemas.microsoft.com/office/word/2018/wordml/cex" xmlns:w16cid="http://schemas.microsoft.com/office/word/2016/wordml/cid" xmlns:w16="http://schemas.microsoft.com/office/word/2018/wordml" xmlns:w16du="http://schemas.microsoft.com/office/word/2023/wordml/word16du" xmlns:w16sdtdh="http://schemas.microsoft.com/office/word/2020/wordml/sdtdatahash" xmlns:w16sdtfl="http://schemas.microsoft.com/office/word/2024/wordml/sdtformatlock" xmlns:w16se="http://schemas.microsoft.com/office/word/2015/wordml/symex" xmlns:wpg="http://schemas.microsoft.com/office/word/2010/wordprocessingGroup" xmlns:wpi="http://schemas.microsoft.com/office/word/2010/wordprocessingInk" xmlns:wne="http://schemas.microsoft.com/office/word/2006/wordml" xmlns:wps="http://schemas.microsoft.com/office/word/2010/wordprocessingShape" mc:Ignorable="w14 w15 w16se w16cid w16 w16cex w16sdtdh w16sdtfl w16du wp14">
   <w:abstractNum w:abstractNumId="0" w15:restartNumberingAfterBreak="0">
     <w:nsid w:val="262D402A"/>
     <w:multiLevelType w:val="hybridMultilevel"/>
@@ -7252,14 +7024,14 @@
       </w:pPr>
     </w:lvl>
   </w:abstractNum>
-  <w:num w:numId="1">
+  <w:num w:numId="1" w16cid:durableId="1832283275">
     <w:abstractNumId w:val="0"/>
   </w:num>
 </w:numbering>
 </file>
 
 <file path=word/styles.xml><?xml version="1.0" encoding="utf-8"?>
-<w:styles xmlns:mc="http://schemas.openxmlformats.org/markup-compatibility/2006" xmlns:r="http://schemas.openxmlformats.org/officeDocument/2006/relationships" xmlns:w="http://schemas.openxmlformats.org/wordprocessingml/2006/main" xmlns:w14="http://schemas.microsoft.com/office/word/2010/wordml" xmlns:w15="http://schemas.microsoft.com/office/word/2012/wordml" xmlns:w16cex="http://schemas.microsoft.com/office/word/2018/wordml/cex" xmlns:w16cid="http://schemas.microsoft.com/office/word/2016/wordml/cid" xmlns:w16="http://schemas.microsoft.com/office/word/2018/wordml" xmlns:w16sdtdh="http://schemas.microsoft.com/office/word/2020/wordml/sdtdatahash" xmlns:w16se="http://schemas.microsoft.com/office/word/2015/wordml/symex" mc:Ignorable="w14 w15 w16se w16cid w16 w16cex w16sdtdh">
+<w:styles xmlns:mc="http://schemas.openxmlformats.org/markup-compatibility/2006" xmlns:r="http://schemas.openxmlformats.org/officeDocument/2006/relationships" xmlns:w="http://schemas.openxmlformats.org/wordprocessingml/2006/main" xmlns:w14="http://schemas.microsoft.com/office/word/2010/wordml" xmlns:w15="http://schemas.microsoft.com/office/word/2012/wordml" xmlns:w16cex="http://schemas.microsoft.com/office/word/2018/wordml/cex" xmlns:w16cid="http://schemas.microsoft.com/office/word/2016/wordml/cid" xmlns:w16="http://schemas.microsoft.com/office/word/2018/wordml" xmlns:w16du="http://schemas.microsoft.com/office/word/2023/wordml/word16du" xmlns:w16sdtdh="http://schemas.microsoft.com/office/word/2020/wordml/sdtdatahash" xmlns:w16sdtfl="http://schemas.microsoft.com/office/word/2024/wordml/sdtformatlock" xmlns:w16se="http://schemas.microsoft.com/office/word/2015/wordml/symex" mc:Ignorable="w14 w15 w16se w16cid w16 w16cex w16sdtdh w16sdtfl w16du">
   <w:docDefaults>
     <w:rPrDefault>
       <w:rPr>

</xml_diff>